<commit_message>
Carta MOBIS: agregar principios de libertad de concurrencia y pluralidad de postores
Co-Authored-By: Claude Opus 5.5 <noreply@anthropic.com>
Claude-Session: https://claude.ai/code/session_01Ls5dNjYBLNjXxuGTDk7v3H
</commit_message>
<xml_diff>
--- a/carta-reclamo/Carta_Reclamo_MOBIS.docx
+++ b/carta-reclamo/Carta_Reclamo_MOBIS.docx
@@ -885,20 +885,46 @@
         <w:t xml:space="preserve"> </w:t>
       </w:r>
       <w:r>
-        <w:t xml:space="preserve">La contratación pública se rige por los principios de</w:t>
-      </w:r>
-      <w:r>
-        <w:t xml:space="preserve"> </w:t>
-      </w:r>
-      <w:r>
-        <w:rPr>
-          <w:bCs/>
-          <w:b/>
-        </w:rPr>
-        <w:t xml:space="preserve">igualdad de trato, libertad de concurrencia, competencia y transparencia</w:t>
-      </w:r>
-      <w:r>
-        <w:t xml:space="preserve">. Ninguna marca puede quedar excluida, por acción u omisión, de competir en igualdad de condiciones.</w:t>
+        <w:t xml:space="preserve">Las contrataciones del Estado se rigen por el principio de</w:t>
+      </w:r>
+      <w:r>
+        <w:t xml:space="preserve"> </w:t>
+      </w:r>
+      <w:r>
+        <w:rPr>
+          <w:bCs/>
+          <w:b/>
+        </w:rPr>
+        <w:t xml:space="preserve">libertad de concurrencia</w:t>
+      </w:r>
+      <w:r>
+        <w:t xml:space="preserve">. Este principio garantiza que</w:t>
+      </w:r>
+      <w:r>
+        <w:t xml:space="preserve"> </w:t>
+      </w:r>
+      <w:r>
+        <w:rPr>
+          <w:bCs/>
+          <w:b/>
+        </w:rPr>
+        <w:t xml:space="preserve">todos los proveedores que cumplan con los requisitos tengan la misma oportunidad de participar, competir y venderle al Estado</w:t>
+      </w:r>
+      <w:r>
+        <w:t xml:space="preserve">, y prohíbe los</w:t>
+      </w:r>
+      <w:r>
+        <w:t xml:space="preserve"> </w:t>
+      </w:r>
+      <w:r>
+        <w:rPr>
+          <w:bCs/>
+          <w:b/>
+        </w:rPr>
+        <w:t xml:space="preserve">monopolios, los favoritismos y las barreras innecesarias</w:t>
+      </w:r>
+      <w:r>
+        <w:t xml:space="preserve">. Al impedir que los proveedores vean y oferten la marca MOBIS, la plataforma levanta justamente una de esas barreras.</w:t>
       </w:r>
     </w:p>
     <w:p>
@@ -916,112 +942,7 @@
         <w:t xml:space="preserve"> </w:t>
       </w:r>
       <w:r>
-        <w:t xml:space="preserve">El silencio de su Dirección vulnera además nuestro</w:t>
-      </w:r>
-      <w:r>
-        <w:t xml:space="preserve"> </w:t>
-      </w:r>
-      <w:r>
-        <w:rPr>
-          <w:bCs/>
-          <w:b/>
-        </w:rPr>
-        <w:t xml:space="preserve">derecho de petición</w:t>
-      </w:r>
-      <w:r>
-        <w:t xml:space="preserve">, reconocido en el</w:t>
-      </w:r>
-      <w:r>
-        <w:t xml:space="preserve"> </w:t>
-      </w:r>
-      <w:r>
-        <w:rPr>
-          <w:bCs/>
-          <w:b/>
-        </w:rPr>
-        <w:t xml:space="preserve">artículo 2, inciso 20 de la Constitución Política del Perú</w:t>
-      </w:r>
-      <w:r>
-        <w:t xml:space="preserve"> </w:t>
-      </w:r>
-      <w:r>
-        <w:t xml:space="preserve">y en el</w:t>
-      </w:r>
-      <w:r>
-        <w:t xml:space="preserve"> </w:t>
-      </w:r>
-      <w:r>
-        <w:rPr>
-          <w:bCs/>
-          <w:b/>
-        </w:rPr>
-        <w:t xml:space="preserve">artículo 117 del TUO de la Ley N.° 27444, Ley del Procedimiento Administrativo General</w:t>
-      </w:r>
-      <w:r>
-        <w:t xml:space="preserve">. Este derecho obliga a la Administración a responder por escrito dentro del plazo legal, que</w:t>
-      </w:r>
-      <w:r>
-        <w:t xml:space="preserve"> </w:t>
-      </w:r>
-      <w:r>
-        <w:rPr>
-          <w:bCs/>
-          <w:b/>
-        </w:rPr>
-        <w:t xml:space="preserve">ya venció hace mucho</w:t>
-      </w:r>
-      <w:r>
-        <w:t xml:space="preserve">.</w:t>
-      </w:r>
-    </w:p>
-    <w:bookmarkEnd w:id="21"/>
-    <w:bookmarkStart w:id="22" w:name="lo-que-exigimos"/>
-    <w:p>
-      <w:pPr>
-        <w:pStyle w:val="Heading2"/>
-      </w:pPr>
-      <w:r>
-        <w:t xml:space="preserve">3. LO QUE EXIGIMOS</w:t>
-      </w:r>
-    </w:p>
-    <w:p>
-      <w:pPr>
-        <w:pStyle w:val="FirstParagraph"/>
-      </w:pPr>
-      <w:r>
-        <w:t xml:space="preserve">Por lo expuesto,</w:t>
-      </w:r>
-      <w:r>
-        <w:t xml:space="preserve"> </w:t>
-      </w:r>
-      <w:r>
-        <w:rPr>
-          <w:bCs/>
-          <w:b/>
-        </w:rPr>
-        <w:t xml:space="preserve">EXIGIMOS</w:t>
-      </w:r>
-      <w:r>
-        <w:t xml:space="preserve"> </w:t>
-      </w:r>
-      <w:r>
-        <w:t xml:space="preserve">que en un plazo</w:t>
-      </w:r>
-      <w:r>
-        <w:t xml:space="preserve"> </w:t>
-      </w:r>
-      <w:r>
-        <w:rPr>
-          <w:bCs/>
-          <w:b/>
-        </w:rPr>
-        <w:t xml:space="preserve">no mayor de cinco (5) días hábiles</w:t>
-      </w:r>
-      <w:r>
-        <w:t xml:space="preserve"> </w:t>
-      </w:r>
-      <w:r>
-        <w:t xml:space="preserve">desde la recepción de esta carta:</w:t>
+        <w:t xml:space="preserve">Esta situación afecta también:</w:t>
       </w:r>
     </w:p>
     <w:p>
@@ -1037,29 +958,26 @@
           <w:bCs/>
           <w:b/>
         </w:rPr>
-        <w:t xml:space="preserve">Se habiliten de inmediato</w:t>
-      </w:r>
-      <w:r>
-        <w:t xml:space="preserve"> </w:t>
-      </w:r>
-      <w:r>
-        <w:t xml:space="preserve">todas las fichas-producto de la marca</w:t>
-      </w:r>
-      <w:r>
-        <w:t xml:space="preserve"> </w:t>
-      </w:r>
-      <w:r>
-        <w:rPr>
-          <w:bCs/>
-          <w:b/>
-        </w:rPr>
-        <w:t xml:space="preserve">MOBIS</w:t>
-      </w:r>
-      <w:r>
-        <w:t xml:space="preserve"> </w:t>
-      </w:r>
-      <w:r>
-        <w:t xml:space="preserve">para que los proveedores las vean en la plataforma de Catálogos Electrónicos y puedan ofertarlas sin restricción.</w:t>
+        <w:t xml:space="preserve">La pluralidad de postores:</w:t>
+      </w:r>
+      <w:r>
+        <w:t xml:space="preserve"> </w:t>
+      </w:r>
+      <w:r>
+        <w:t xml:space="preserve">el Estado debe buscar que existan</w:t>
+      </w:r>
+      <w:r>
+        <w:t xml:space="preserve"> </w:t>
+      </w:r>
+      <w:r>
+        <w:rPr>
+          <w:bCs/>
+          <w:b/>
+        </w:rPr>
+        <w:t xml:space="preserve">múltiples opciones y participantes</w:t>
+      </w:r>
+      <w:r>
+        <w:t xml:space="preserve">. Si se dejan fuera las fichas MOBIS, las entidades pierden una alternativa válida y la competencia se reduce a las marcas que el sistema sí muestra.</w:t>
       </w:r>
     </w:p>
     <w:p>
@@ -1075,83 +993,117 @@
           <w:bCs/>
           <w:b/>
         </w:rPr>
-        <w:t xml:space="preserve">Se nos informe por escrito</w:t>
-      </w:r>
-      <w:r>
-        <w:t xml:space="preserve"> </w:t>
-      </w:r>
-      <w:r>
-        <w:t xml:space="preserve">por qué no aparecen nuestras fichas, quién es el área o funcionario responsable y qué medidas correctivas se tomarán.</w:t>
-      </w:r>
-    </w:p>
-    <w:p>
-      <w:pPr>
-        <w:numPr>
-          <w:ilvl w:val="0"/>
-          <w:numId w:val="1003"/>
-        </w:numPr>
-        <w:pStyle w:val="Compact"/>
-      </w:pPr>
-      <w:r>
-        <w:rPr>
-          <w:bCs/>
-          <w:b/>
-        </w:rPr>
-        <w:t xml:space="preserve">Se responda por escrito</w:t>
-      </w:r>
-      <w:r>
-        <w:t xml:space="preserve"> </w:t>
-      </w:r>
-      <w:r>
-        <w:t xml:space="preserve">a cada una de las comunicaciones de las referencias.</w:t>
-      </w:r>
-    </w:p>
-    <w:p>
-      <w:pPr>
-        <w:numPr>
-          <w:ilvl w:val="0"/>
-          <w:numId w:val="1003"/>
-        </w:numPr>
-        <w:pStyle w:val="Compact"/>
-      </w:pPr>
-      <w:r>
-        <w:rPr>
-          <w:bCs/>
-          <w:b/>
-        </w:rPr>
-        <w:t xml:space="preserve">Se garantice</w:t>
-      </w:r>
-      <w:r>
-        <w:t xml:space="preserve"> </w:t>
-      </w:r>
-      <w:r>
-        <w:t xml:space="preserve">que las fichas MOBIS reciban</w:t>
-      </w:r>
-      <w:r>
-        <w:t xml:space="preserve"> </w:t>
-      </w:r>
-      <w:r>
-        <w:rPr>
-          <w:bCs/>
-          <w:b/>
-        </w:rPr>
-        <w:t xml:space="preserve">el mismo trato</w:t>
-      </w:r>
-      <w:r>
-        <w:t xml:space="preserve"> </w:t>
-      </w:r>
-      <w:r>
-        <w:t xml:space="preserve">que las fichas de las demás marcas del catálogo.</w:t>
-      </w:r>
-    </w:p>
-    <w:bookmarkEnd w:id="22"/>
-    <w:bookmarkStart w:id="23" w:name="reserva-de-acciones"/>
+        <w:t xml:space="preserve">La transparencia y la igualdad de trato:</w:t>
+      </w:r>
+      <w:r>
+        <w:t xml:space="preserve"> </w:t>
+      </w:r>
+      <w:r>
+        <w:t xml:space="preserve">las reglas deben ser</w:t>
+      </w:r>
+      <w:r>
+        <w:t xml:space="preserve"> </w:t>
+      </w:r>
+      <w:r>
+        <w:rPr>
+          <w:bCs/>
+          <w:b/>
+        </w:rPr>
+        <w:t xml:space="preserve">claras y las mismas para todos</w:t>
+      </w:r>
+      <w:r>
+        <w:t xml:space="preserve">. Hoy las fichas de otras marcas de la misma categoría funcionan con normalidad y las nuestras no, sin que nadie nos explique por qué.</w:t>
+      </w:r>
+    </w:p>
+    <w:p>
+      <w:pPr>
+        <w:pStyle w:val="FirstParagraph"/>
+      </w:pPr>
+      <w:r>
+        <w:t xml:space="preserve">Ninguna marca puede quedar excluida, por acción u omisión, de competir en igualdad de condiciones.</w:t>
+      </w:r>
+    </w:p>
+    <w:p>
+      <w:pPr>
+        <w:pStyle w:val="BodyText"/>
+      </w:pPr>
+      <w:r>
+        <w:rPr>
+          <w:bCs/>
+          <w:b/>
+        </w:rPr>
+        <w:t xml:space="preserve">2.5.</w:t>
+      </w:r>
+      <w:r>
+        <w:t xml:space="preserve"> </w:t>
+      </w:r>
+      <w:r>
+        <w:t xml:space="preserve">El silencio de su Dirección vulnera además nuestro</w:t>
+      </w:r>
+      <w:r>
+        <w:t xml:space="preserve"> </w:t>
+      </w:r>
+      <w:r>
+        <w:rPr>
+          <w:bCs/>
+          <w:b/>
+        </w:rPr>
+        <w:t xml:space="preserve">derecho de petición</w:t>
+      </w:r>
+      <w:r>
+        <w:t xml:space="preserve">, reconocido en el</w:t>
+      </w:r>
+      <w:r>
+        <w:t xml:space="preserve"> </w:t>
+      </w:r>
+      <w:r>
+        <w:rPr>
+          <w:bCs/>
+          <w:b/>
+        </w:rPr>
+        <w:t xml:space="preserve">artículo 2, inciso 20 de la Constitución Política del Perú</w:t>
+      </w:r>
+      <w:r>
+        <w:t xml:space="preserve"> </w:t>
+      </w:r>
+      <w:r>
+        <w:t xml:space="preserve">y en el</w:t>
+      </w:r>
+      <w:r>
+        <w:t xml:space="preserve"> </w:t>
+      </w:r>
+      <w:r>
+        <w:rPr>
+          <w:bCs/>
+          <w:b/>
+        </w:rPr>
+        <w:t xml:space="preserve">artículo 117 del TUO de la Ley N.° 27444, Ley del Procedimiento Administrativo General</w:t>
+      </w:r>
+      <w:r>
+        <w:t xml:space="preserve">. Este derecho obliga a la Administración a responder por escrito dentro del plazo legal, que</w:t>
+      </w:r>
+      <w:r>
+        <w:t xml:space="preserve"> </w:t>
+      </w:r>
+      <w:r>
+        <w:rPr>
+          <w:bCs/>
+          <w:b/>
+        </w:rPr>
+        <w:t xml:space="preserve">ya venció hace mucho</w:t>
+      </w:r>
+      <w:r>
+        <w:t xml:space="preserve">.</w:t>
+      </w:r>
+    </w:p>
+    <w:bookmarkEnd w:id="21"/>
+    <w:bookmarkStart w:id="22" w:name="lo-que-exigimos"/>
     <w:p>
       <w:pPr>
         <w:pStyle w:val="Heading2"/>
       </w:pPr>
       <w:r>
-        <w:t xml:space="preserve">4. RESERVA DE ACCIONES</w:t>
+        <w:t xml:space="preserve">3. LO QUE EXIGIMOS</w:t>
       </w:r>
     </w:p>
     <w:p>
@@ -1159,20 +1111,39 @@
         <w:pStyle w:val="FirstParagraph"/>
       </w:pPr>
       <w:r>
-        <w:t xml:space="preserve">Si no recibimos una respuesta satisfactoria dentro del plazo indicado,</w:t>
-      </w:r>
-      <w:r>
-        <w:t xml:space="preserve"> </w:t>
-      </w:r>
-      <w:r>
-        <w:rPr>
-          <w:bCs/>
-          <w:b/>
-        </w:rPr>
-        <w:t xml:space="preserve">ejerceremos todas las acciones que la ley nos permite</w:t>
-      </w:r>
-      <w:r>
-        <w:t xml:space="preserve">, entre ellas:</w:t>
+        <w:t xml:space="preserve">Por lo expuesto,</w:t>
+      </w:r>
+      <w:r>
+        <w:t xml:space="preserve"> </w:t>
+      </w:r>
+      <w:r>
+        <w:rPr>
+          <w:bCs/>
+          <w:b/>
+        </w:rPr>
+        <w:t xml:space="preserve">EXIGIMOS</w:t>
+      </w:r>
+      <w:r>
+        <w:t xml:space="preserve"> </w:t>
+      </w:r>
+      <w:r>
+        <w:t xml:space="preserve">que en un plazo</w:t>
+      </w:r>
+      <w:r>
+        <w:t xml:space="preserve"> </w:t>
+      </w:r>
+      <w:r>
+        <w:rPr>
+          <w:bCs/>
+          <w:b/>
+        </w:rPr>
+        <w:t xml:space="preserve">no mayor de cinco (5) días hábiles</w:t>
+      </w:r>
+      <w:r>
+        <w:t xml:space="preserve"> </w:t>
+      </w:r>
+      <w:r>
+        <w:t xml:space="preserve">desde la recepción de esta carta:</w:t>
       </w:r>
     </w:p>
     <w:p>
@@ -1184,33 +1155,33 @@
         <w:pStyle w:val="Compact"/>
       </w:pPr>
       <w:r>
-        <w:t xml:space="preserve">Presentar una</w:t>
-      </w:r>
-      <w:r>
-        <w:t xml:space="preserve"> </w:t>
-      </w:r>
-      <w:r>
-        <w:rPr>
-          <w:bCs/>
-          <w:b/>
-        </w:rPr>
-        <w:t xml:space="preserve">queja por defecto de tramitación</w:t>
-      </w:r>
-      <w:r>
-        <w:t xml:space="preserve">, según el</w:t>
-      </w:r>
-      <w:r>
-        <w:t xml:space="preserve"> </w:t>
-      </w:r>
-      <w:r>
-        <w:rPr>
-          <w:bCs/>
-          <w:b/>
-        </w:rPr>
-        <w:t xml:space="preserve">artículo 169 del TUO de la Ley N.° 27444</w:t>
-      </w:r>
-      <w:r>
-        <w:t xml:space="preserve">.</w:t>
+        <w:rPr>
+          <w:bCs/>
+          <w:b/>
+        </w:rPr>
+        <w:t xml:space="preserve">Se habiliten de inmediato</w:t>
+      </w:r>
+      <w:r>
+        <w:t xml:space="preserve"> </w:t>
+      </w:r>
+      <w:r>
+        <w:t xml:space="preserve">todas las fichas-producto de la marca</w:t>
+      </w:r>
+      <w:r>
+        <w:t xml:space="preserve"> </w:t>
+      </w:r>
+      <w:r>
+        <w:rPr>
+          <w:bCs/>
+          <w:b/>
+        </w:rPr>
+        <w:t xml:space="preserve">MOBIS</w:t>
+      </w:r>
+      <w:r>
+        <w:t xml:space="preserve"> </w:t>
+      </w:r>
+      <w:r>
+        <w:t xml:space="preserve">para que los proveedores las vean en la plataforma de Catálogos Electrónicos y puedan ofertarlas sin restricción.</w:t>
       </w:r>
     </w:p>
     <w:p>
@@ -1222,36 +1193,17 @@
         <w:pStyle w:val="Compact"/>
       </w:pPr>
       <w:r>
-        <w:t xml:space="preserve">Informar de estos hechos al</w:t>
-      </w:r>
-      <w:r>
-        <w:t xml:space="preserve"> </w:t>
-      </w:r>
-      <w:r>
-        <w:rPr>
-          <w:bCs/>
-          <w:b/>
-        </w:rPr>
-        <w:t xml:space="preserve">Órgano de Control Institucional (OCI) de PERÚ COMPRAS</w:t>
-      </w:r>
-      <w:r>
-        <w:t xml:space="preserve"> </w:t>
-      </w:r>
-      <w:r>
-        <w:t xml:space="preserve">y a la</w:t>
-      </w:r>
-      <w:r>
-        <w:t xml:space="preserve"> </w:t>
-      </w:r>
-      <w:r>
-        <w:rPr>
-          <w:bCs/>
-          <w:b/>
-        </w:rPr>
-        <w:t xml:space="preserve">Contraloría General de la República</w:t>
-      </w:r>
-      <w:r>
-        <w:t xml:space="preserve">.</w:t>
+        <w:rPr>
+          <w:bCs/>
+          <w:b/>
+        </w:rPr>
+        <w:t xml:space="preserve">Se nos informe por escrito</w:t>
+      </w:r>
+      <w:r>
+        <w:t xml:space="preserve"> </w:t>
+      </w:r>
+      <w:r>
+        <w:t xml:space="preserve">por qué no aparecen nuestras fichas, quién es el área o funcionario responsable y qué medidas correctivas se tomarán.</w:t>
       </w:r>
     </w:p>
     <w:p>
@@ -1263,20 +1215,17 @@
         <w:pStyle w:val="Compact"/>
       </w:pPr>
       <w:r>
-        <w:t xml:space="preserve">Acudir a la</w:t>
-      </w:r>
-      <w:r>
-        <w:t xml:space="preserve"> </w:t>
-      </w:r>
-      <w:r>
-        <w:rPr>
-          <w:bCs/>
-          <w:b/>
-        </w:rPr>
-        <w:t xml:space="preserve">Defensoría del Pueblo</w:t>
-      </w:r>
-      <w:r>
-        <w:t xml:space="preserve">.</w:t>
+        <w:rPr>
+          <w:bCs/>
+          <w:b/>
+        </w:rPr>
+        <w:t xml:space="preserve">Se responda por escrito</w:t>
+      </w:r>
+      <w:r>
+        <w:t xml:space="preserve"> </w:t>
+      </w:r>
+      <w:r>
+        <w:t xml:space="preserve">a cada una de las comunicaciones de las referencias.</w:t>
       </w:r>
     </w:p>
     <w:p>
@@ -1288,39 +1237,56 @@
         <w:pStyle w:val="Compact"/>
       </w:pPr>
       <w:r>
-        <w:t xml:space="preserve">Iniciar las</w:t>
-      </w:r>
-      <w:r>
-        <w:t xml:space="preserve"> </w:t>
-      </w:r>
-      <w:r>
-        <w:rPr>
-          <w:bCs/>
-          <w:b/>
-        </w:rPr>
-        <w:t xml:space="preserve">acciones administrativas y judiciales</w:t>
-      </w:r>
-      <w:r>
-        <w:t xml:space="preserve"> </w:t>
-      </w:r>
-      <w:r>
-        <w:t xml:space="preserve">para reclamar la</w:t>
-      </w:r>
-      <w:r>
-        <w:t xml:space="preserve"> </w:t>
-      </w:r>
-      <w:r>
-        <w:rPr>
-          <w:bCs/>
-          <w:b/>
-        </w:rPr>
-        <w:t xml:space="preserve">indemnización por los daños y perjuicios</w:t>
-      </w:r>
-      <w:r>
-        <w:t xml:space="preserve"> </w:t>
-      </w:r>
-      <w:r>
-        <w:t xml:space="preserve">causados.</w:t>
+        <w:rPr>
+          <w:bCs/>
+          <w:b/>
+        </w:rPr>
+        <w:t xml:space="preserve">Se garantice</w:t>
+      </w:r>
+      <w:r>
+        <w:t xml:space="preserve"> </w:t>
+      </w:r>
+      <w:r>
+        <w:t xml:space="preserve">que las fichas MOBIS reciban</w:t>
+      </w:r>
+      <w:r>
+        <w:t xml:space="preserve"> </w:t>
+      </w:r>
+      <w:r>
+        <w:rPr>
+          <w:bCs/>
+          <w:b/>
+        </w:rPr>
+        <w:t xml:space="preserve">el mismo trato</w:t>
+      </w:r>
+      <w:r>
+        <w:t xml:space="preserve"> </w:t>
+      </w:r>
+      <w:r>
+        <w:t xml:space="preserve">que las fichas de las demás marcas del catálogo, en respeto de los principios de</w:t>
+      </w:r>
+      <w:r>
+        <w:t xml:space="preserve"> </w:t>
+      </w:r>
+      <w:r>
+        <w:rPr>
+          <w:bCs/>
+          <w:b/>
+        </w:rPr>
+        <w:t xml:space="preserve">libertad de concurrencia, pluralidad de postores, transparencia e igualdad de trato</w:t>
+      </w:r>
+      <w:r>
+        <w:t xml:space="preserve">.</w:t>
+      </w:r>
+    </w:p>
+    <w:bookmarkEnd w:id="22"/>
+    <w:bookmarkStart w:id="23" w:name="reserva-de-acciones"/>
+    <w:p>
+      <w:pPr>
+        <w:pStyle w:val="Heading2"/>
+      </w:pPr>
+      <w:r>
+        <w:t xml:space="preserve">4. RESERVA DE ACCIONES</w:t>
       </w:r>
     </w:p>
     <w:p>
@@ -1328,139 +1294,20 @@
         <w:pStyle w:val="FirstParagraph"/>
       </w:pPr>
       <w:r>
-        <w:t xml:space="preserve">Llevamos meses esperando.</w:t>
-      </w:r>
-      <w:r>
-        <w:t xml:space="preserve"> </w:t>
-      </w:r>
-      <w:r>
-        <w:rPr>
-          <w:bCs/>
-          <w:b/>
-        </w:rPr>
-        <w:t xml:space="preserve">No vamos a seguir esperando en silencio.</w:t>
-      </w:r>
-    </w:p>
-    <w:p>
-      <w:pPr>
-        <w:pStyle w:val="BodyText"/>
-      </w:pPr>
-      <w:r>
-        <w:t xml:space="preserve">Quedamos a la espera de su</w:t>
-      </w:r>
-      <w:r>
-        <w:t xml:space="preserve"> </w:t>
-      </w:r>
-      <w:r>
-        <w:rPr>
-          <w:bCs/>
-          <w:b/>
-        </w:rPr>
-        <w:t xml:space="preserve">respuesta inmediata y por escrito</w:t>
-      </w:r>
-      <w:r>
-        <w:t xml:space="preserve">.</w:t>
-      </w:r>
-    </w:p>
-    <w:p>
-      <w:pPr>
-        <w:pStyle w:val="BodyText"/>
-      </w:pPr>
-      <w:r>
-        <w:t xml:space="preserve">Atentamente,</w:t>
-      </w:r>
-    </w:p>
-    <w:p>
-      <w:pPr>
-        <w:pStyle w:val="BodyText"/>
-      </w:pPr>
-      <w:r>
-        <w:t xml:space="preserve"> </w:t>
-      </w:r>
-    </w:p>
-    <w:p>
-      <w:pPr>
-        <w:pStyle w:val="BodyText"/>
-      </w:pPr>
-      <w:r>
-        <w:t xml:space="preserve"> </w:t>
-      </w:r>
-    </w:p>
-    <w:p>
-      <w:pPr>
-        <w:pStyle w:val="BodyText"/>
-      </w:pPr>
-      <w:r>
-        <w:t xml:space="preserve">___________________________________</w:t>
-      </w:r>
-      <w:r>
-        <w:br/>
-      </w:r>
-      <w:r>
-        <w:rPr>
-          <w:bCs/>
-          <w:b/>
-        </w:rPr>
-        <w:t xml:space="preserve">FAVIOLA ORIHUELA PIMENTEL</w:t>
-      </w:r>
-      <w:r>
-        <w:br/>
-      </w:r>
-      <w:r>
-        <w:t xml:space="preserve">DNI N.° [________]</w:t>
-      </w:r>
-      <w:r>
-        <w:br/>
-      </w:r>
-      <w:r>
-        <w:t xml:space="preserve">Gerente</w:t>
-      </w:r>
-      <w:r>
-        <w:br/>
-      </w:r>
-      <w:r>
-        <w:rPr>
-          <w:bCs/>
-          <w:b/>
-        </w:rPr>
-        <w:t xml:space="preserve">SERVICIOS BARTEK E.I.R.L.</w:t>
-      </w:r>
-      <w:r>
-        <w:t xml:space="preserve"> </w:t>
-      </w:r>
-      <w:r>
-        <w:t xml:space="preserve">– RUC N.° 20610900551</w:t>
-      </w:r>
-      <w:r>
-        <w:br/>
-      </w:r>
-      <w:r>
-        <w:t xml:space="preserve">Correo: serviciosbartek@gmail.com · Teléfono: [___________]</w:t>
-      </w:r>
-      <w:r>
-        <w:br/>
-      </w:r>
-      <w:r>
-        <w:t xml:space="preserve">Domicilio: [______________________]</w:t>
-      </w:r>
-    </w:p>
-    <w:p>
-      <w:r>
-        <w:pict>
-          <v:rect style="width:0;height:1.5pt" o:hralign="center" o:hrstd="t" o:hr="t"/>
-        </w:pict>
-      </w:r>
-    </w:p>
-    <w:p>
-      <w:pPr>
-        <w:pStyle w:val="FirstParagraph"/>
-      </w:pPr>
-      <w:r>
-        <w:rPr>
-          <w:bCs/>
-          <w:b/>
-        </w:rPr>
-        <w:t xml:space="preserve">ANEXOS:</w:t>
+        <w:t xml:space="preserve">Si no recibimos una respuesta satisfactoria dentro del plazo indicado,</w:t>
+      </w:r>
+      <w:r>
+        <w:t xml:space="preserve"> </w:t>
+      </w:r>
+      <w:r>
+        <w:rPr>
+          <w:bCs/>
+          <w:b/>
+        </w:rPr>
+        <w:t xml:space="preserve">ejerceremos todas las acciones que la ley nos permite</w:t>
+      </w:r>
+      <w:r>
+        <w:t xml:space="preserve">, entre ellas:</w:t>
       </w:r>
     </w:p>
     <w:p>
@@ -1472,17 +1319,33 @@
         <w:pStyle w:val="Compact"/>
       </w:pPr>
       <w:r>
-        <w:rPr>
-          <w:bCs/>
-          <w:b/>
-        </w:rPr>
-        <w:t xml:space="preserve">Anexo 1:</w:t>
-      </w:r>
-      <w:r>
-        <w:t xml:space="preserve"> </w:t>
-      </w:r>
-      <w:r>
-        <w:t xml:space="preserve">Capturas de la plataforma de Catálogos Electrónicos (perfil proveedor) que muestran que las fichas MOBIS no aparecen y que las de otras marcas sí.</w:t>
+        <w:t xml:space="preserve">Presentar una</w:t>
+      </w:r>
+      <w:r>
+        <w:t xml:space="preserve"> </w:t>
+      </w:r>
+      <w:r>
+        <w:rPr>
+          <w:bCs/>
+          <w:b/>
+        </w:rPr>
+        <w:t xml:space="preserve">queja por defecto de tramitación</w:t>
+      </w:r>
+      <w:r>
+        <w:t xml:space="preserve">, según el</w:t>
+      </w:r>
+      <w:r>
+        <w:t xml:space="preserve"> </w:t>
+      </w:r>
+      <w:r>
+        <w:rPr>
+          <w:bCs/>
+          <w:b/>
+        </w:rPr>
+        <w:t xml:space="preserve">artículo 169 del TUO de la Ley N.° 27444</w:t>
+      </w:r>
+      <w:r>
+        <w:t xml:space="preserve">.</w:t>
       </w:r>
     </w:p>
     <w:p>
@@ -1494,17 +1357,36 @@
         <w:pStyle w:val="Compact"/>
       </w:pPr>
       <w:r>
-        <w:rPr>
-          <w:bCs/>
-          <w:b/>
-        </w:rPr>
-        <w:t xml:space="preserve">Anexo 2:</w:t>
-      </w:r>
-      <w:r>
-        <w:t xml:space="preserve"> </w:t>
-      </w:r>
-      <w:r>
-        <w:t xml:space="preserve">Mensaje de un proveedor que confirma que recibe nuestro stock pero no encuentra la marca MOBIS en la plataforma.</w:t>
+        <w:t xml:space="preserve">Informar de estos hechos al</w:t>
+      </w:r>
+      <w:r>
+        <w:t xml:space="preserve"> </w:t>
+      </w:r>
+      <w:r>
+        <w:rPr>
+          <w:bCs/>
+          <w:b/>
+        </w:rPr>
+        <w:t xml:space="preserve">Órgano de Control Institucional (OCI) de PERÚ COMPRAS</w:t>
+      </w:r>
+      <w:r>
+        <w:t xml:space="preserve"> </w:t>
+      </w:r>
+      <w:r>
+        <w:t xml:space="preserve">y a la</w:t>
+      </w:r>
+      <w:r>
+        <w:t xml:space="preserve"> </w:t>
+      </w:r>
+      <w:r>
+        <w:rPr>
+          <w:bCs/>
+          <w:b/>
+        </w:rPr>
+        <w:t xml:space="preserve">Contraloría General de la República</w:t>
+      </w:r>
+      <w:r>
+        <w:t xml:space="preserve">.</w:t>
       </w:r>
     </w:p>
     <w:p>
@@ -1512,6 +1394,259 @@
         <w:numPr>
           <w:ilvl w:val="0"/>
           <w:numId w:val="1005"/>
+        </w:numPr>
+        <w:pStyle w:val="Compact"/>
+      </w:pPr>
+      <w:r>
+        <w:t xml:space="preserve">Acudir a la</w:t>
+      </w:r>
+      <w:r>
+        <w:t xml:space="preserve"> </w:t>
+      </w:r>
+      <w:r>
+        <w:rPr>
+          <w:bCs/>
+          <w:b/>
+        </w:rPr>
+        <w:t xml:space="preserve">Defensoría del Pueblo</w:t>
+      </w:r>
+      <w:r>
+        <w:t xml:space="preserve">.</w:t>
+      </w:r>
+    </w:p>
+    <w:p>
+      <w:pPr>
+        <w:numPr>
+          <w:ilvl w:val="0"/>
+          <w:numId w:val="1005"/>
+        </w:numPr>
+        <w:pStyle w:val="Compact"/>
+      </w:pPr>
+      <w:r>
+        <w:t xml:space="preserve">Iniciar las</w:t>
+      </w:r>
+      <w:r>
+        <w:t xml:space="preserve"> </w:t>
+      </w:r>
+      <w:r>
+        <w:rPr>
+          <w:bCs/>
+          <w:b/>
+        </w:rPr>
+        <w:t xml:space="preserve">acciones administrativas y judiciales</w:t>
+      </w:r>
+      <w:r>
+        <w:t xml:space="preserve"> </w:t>
+      </w:r>
+      <w:r>
+        <w:t xml:space="preserve">para reclamar la</w:t>
+      </w:r>
+      <w:r>
+        <w:t xml:space="preserve"> </w:t>
+      </w:r>
+      <w:r>
+        <w:rPr>
+          <w:bCs/>
+          <w:b/>
+        </w:rPr>
+        <w:t xml:space="preserve">indemnización por los daños y perjuicios</w:t>
+      </w:r>
+      <w:r>
+        <w:t xml:space="preserve"> </w:t>
+      </w:r>
+      <w:r>
+        <w:t xml:space="preserve">causados.</w:t>
+      </w:r>
+    </w:p>
+    <w:p>
+      <w:pPr>
+        <w:pStyle w:val="FirstParagraph"/>
+      </w:pPr>
+      <w:r>
+        <w:t xml:space="preserve">Llevamos meses esperando.</w:t>
+      </w:r>
+      <w:r>
+        <w:t xml:space="preserve"> </w:t>
+      </w:r>
+      <w:r>
+        <w:rPr>
+          <w:bCs/>
+          <w:b/>
+        </w:rPr>
+        <w:t xml:space="preserve">No vamos a seguir esperando en silencio.</w:t>
+      </w:r>
+    </w:p>
+    <w:p>
+      <w:pPr>
+        <w:pStyle w:val="BodyText"/>
+      </w:pPr>
+      <w:r>
+        <w:t xml:space="preserve">Quedamos a la espera de su</w:t>
+      </w:r>
+      <w:r>
+        <w:t xml:space="preserve"> </w:t>
+      </w:r>
+      <w:r>
+        <w:rPr>
+          <w:bCs/>
+          <w:b/>
+        </w:rPr>
+        <w:t xml:space="preserve">respuesta inmediata y por escrito</w:t>
+      </w:r>
+      <w:r>
+        <w:t xml:space="preserve">.</w:t>
+      </w:r>
+    </w:p>
+    <w:p>
+      <w:pPr>
+        <w:pStyle w:val="BodyText"/>
+      </w:pPr>
+      <w:r>
+        <w:t xml:space="preserve">Atentamente,</w:t>
+      </w:r>
+    </w:p>
+    <w:p>
+      <w:pPr>
+        <w:pStyle w:val="BodyText"/>
+      </w:pPr>
+      <w:r>
+        <w:t xml:space="preserve"> </w:t>
+      </w:r>
+    </w:p>
+    <w:p>
+      <w:pPr>
+        <w:pStyle w:val="BodyText"/>
+      </w:pPr>
+      <w:r>
+        <w:t xml:space="preserve"> </w:t>
+      </w:r>
+    </w:p>
+    <w:p>
+      <w:pPr>
+        <w:pStyle w:val="BodyText"/>
+      </w:pPr>
+      <w:r>
+        <w:t xml:space="preserve">___________________________________</w:t>
+      </w:r>
+      <w:r>
+        <w:br/>
+      </w:r>
+      <w:r>
+        <w:rPr>
+          <w:bCs/>
+          <w:b/>
+        </w:rPr>
+        <w:t xml:space="preserve">FAVIOLA ORIHUELA PIMENTEL</w:t>
+      </w:r>
+      <w:r>
+        <w:br/>
+      </w:r>
+      <w:r>
+        <w:t xml:space="preserve">DNI N.° [________]</w:t>
+      </w:r>
+      <w:r>
+        <w:br/>
+      </w:r>
+      <w:r>
+        <w:t xml:space="preserve">Gerente</w:t>
+      </w:r>
+      <w:r>
+        <w:br/>
+      </w:r>
+      <w:r>
+        <w:rPr>
+          <w:bCs/>
+          <w:b/>
+        </w:rPr>
+        <w:t xml:space="preserve">SERVICIOS BARTEK E.I.R.L.</w:t>
+      </w:r>
+      <w:r>
+        <w:t xml:space="preserve"> </w:t>
+      </w:r>
+      <w:r>
+        <w:t xml:space="preserve">– RUC N.° 20610900551</w:t>
+      </w:r>
+      <w:r>
+        <w:br/>
+      </w:r>
+      <w:r>
+        <w:t xml:space="preserve">Correo: serviciosbartek@gmail.com · Teléfono: [___________]</w:t>
+      </w:r>
+      <w:r>
+        <w:br/>
+      </w:r>
+      <w:r>
+        <w:t xml:space="preserve">Domicilio: [______________________]</w:t>
+      </w:r>
+    </w:p>
+    <w:p>
+      <w:r>
+        <w:pict>
+          <v:rect style="width:0;height:1.5pt" o:hralign="center" o:hrstd="t" o:hr="t"/>
+        </w:pict>
+      </w:r>
+    </w:p>
+    <w:p>
+      <w:pPr>
+        <w:pStyle w:val="FirstParagraph"/>
+      </w:pPr>
+      <w:r>
+        <w:rPr>
+          <w:bCs/>
+          <w:b/>
+        </w:rPr>
+        <w:t xml:space="preserve">ANEXOS:</w:t>
+      </w:r>
+    </w:p>
+    <w:p>
+      <w:pPr>
+        <w:numPr>
+          <w:ilvl w:val="0"/>
+          <w:numId w:val="1006"/>
+        </w:numPr>
+        <w:pStyle w:val="Compact"/>
+      </w:pPr>
+      <w:r>
+        <w:rPr>
+          <w:bCs/>
+          <w:b/>
+        </w:rPr>
+        <w:t xml:space="preserve">Anexo 1:</w:t>
+      </w:r>
+      <w:r>
+        <w:t xml:space="preserve"> </w:t>
+      </w:r>
+      <w:r>
+        <w:t xml:space="preserve">Capturas de la plataforma de Catálogos Electrónicos (perfil proveedor) que muestran que las fichas MOBIS no aparecen y que las de otras marcas sí.</w:t>
+      </w:r>
+    </w:p>
+    <w:p>
+      <w:pPr>
+        <w:numPr>
+          <w:ilvl w:val="0"/>
+          <w:numId w:val="1006"/>
+        </w:numPr>
+        <w:pStyle w:val="Compact"/>
+      </w:pPr>
+      <w:r>
+        <w:rPr>
+          <w:bCs/>
+          <w:b/>
+        </w:rPr>
+        <w:t xml:space="preserve">Anexo 2:</w:t>
+      </w:r>
+      <w:r>
+        <w:t xml:space="preserve"> </w:t>
+      </w:r>
+      <w:r>
+        <w:t xml:space="preserve">Mensaje de un proveedor que confirma que recibe nuestro stock pero no encuentra la marca MOBIS en la plataforma.</w:t>
+      </w:r>
+    </w:p>
+    <w:p>
+      <w:pPr>
+        <w:numPr>
+          <w:ilvl w:val="0"/>
+          <w:numId w:val="1006"/>
         </w:numPr>
         <w:pStyle w:val="Compact"/>
       </w:pPr>
@@ -1919,6 +2054,9 @@
     <w:abstractNumId w:val="991"/>
   </w:num>
   <w:num w:numId="1003">
+    <w:abstractNumId w:val="991"/>
+  </w:num>
+  <w:num w:numId="1004">
     <w:abstractNumId w:val="99411"/>
     <w:lvlOverride w:ilvl="0">
       <w:startOverride w:val="1"/>
@@ -1948,10 +2086,10 @@
       <w:startOverride w:val="1"/>
     </w:lvlOverride>
   </w:num>
-  <w:num w:numId="1004">
+  <w:num w:numId="1005">
     <w:abstractNumId w:val="991"/>
   </w:num>
-  <w:num w:numId="1005">
+  <w:num w:numId="1006">
     <w:abstractNumId w:val="991"/>
   </w:num>
 </w:numbering>

</xml_diff>

<commit_message>
Carta MOBIS: plazo de carga del 01 al 09 y anexos con capturas
Co-Authored-By: Claude Opus 5.5 <noreply@anthropic.com>
Claude-Session: https://claude.ai/code/session_01Ls5dNjYBLNjXxuGTDk7v3H
</commit_message>
<xml_diff>
--- a/carta-reclamo/Carta_Reclamo_MOBIS.docx
+++ b/carta-reclamo/Carta_Reclamo_MOBIS.docx
@@ -747,6 +747,66 @@
         <w:t xml:space="preserve"> </w:t>
       </w:r>
       <w:r>
+        <w:t xml:space="preserve">Este problema es especialmente grave porque</w:t>
+      </w:r>
+      <w:r>
+        <w:t xml:space="preserve"> </w:t>
+      </w:r>
+      <w:r>
+        <w:rPr>
+          <w:bCs/>
+          <w:b/>
+        </w:rPr>
+        <w:t xml:space="preserve">los proveedores solo pueden subir sus fichas a la plataforma del 01 al 09 de cada mes</w:t>
+      </w:r>
+      <w:r>
+        <w:t xml:space="preserve">. Al día de hoy,</w:t>
+      </w:r>
+      <w:r>
+        <w:t xml:space="preserve"> </w:t>
+      </w:r>
+      <w:r>
+        <w:rPr>
+          <w:bCs/>
+          <w:b/>
+        </w:rPr>
+        <w:t xml:space="preserve">el periodo de octubre vence el viernes 9 de octubre de 2026</w:t>
+      </w:r>
+      <w:r>
+        <w:t xml:space="preserve">. Si las fichas MOBIS no se habilitan antes de esa fecha, los proveedores</w:t>
+      </w:r>
+      <w:r>
+        <w:t xml:space="preserve"> </w:t>
+      </w:r>
+      <w:r>
+        <w:rPr>
+          <w:bCs/>
+          <w:b/>
+        </w:rPr>
+        <w:t xml:space="preserve">perderán todo el mes</w:t>
+      </w:r>
+      <w:r>
+        <w:t xml:space="preserve"> </w:t>
+      </w:r>
+      <w:r>
+        <w:t xml:space="preserve">sin poder ofertar nuestra marca.</w:t>
+      </w:r>
+    </w:p>
+    <w:p>
+      <w:pPr>
+        <w:pStyle w:val="BodyText"/>
+      </w:pPr>
+      <w:r>
+        <w:rPr>
+          <w:bCs/>
+          <w:b/>
+        </w:rPr>
+        <w:t xml:space="preserve">2.4.</w:t>
+      </w:r>
+      <w:r>
+        <w:t xml:space="preserve"> </w:t>
+      </w:r>
+      <w:r>
         <w:rPr>
           <w:bCs/>
           <w:b/>
@@ -808,17 +868,30 @@
         <w:t xml:space="preserve"> </w:t>
       </w:r>
       <w:r>
-        <w:t xml:space="preserve">Pudo empezar hace días, semanas o meses. Si las fichas MOBIS llevan tiempo sin ser visibles,</w:t>
-      </w:r>
-      <w:r>
-        <w:t xml:space="preserve"> </w:t>
-      </w:r>
-      <w:r>
-        <w:rPr>
-          <w:bCs/>
-          <w:b/>
-        </w:rPr>
-        <w:t xml:space="preserve">hemos perdido ventas sin saberlo</w:t>
+        <w:t xml:space="preserve">Pudo empezar hace días, semanas o meses. Si las fichas MOBIS llevan tiempo sin ser visibles, los proveedores pueden haber perdido</w:t>
+      </w:r>
+      <w:r>
+        <w:t xml:space="preserve"> </w:t>
+      </w:r>
+      <w:r>
+        <w:rPr>
+          <w:bCs/>
+          <w:b/>
+        </w:rPr>
+        <w:t xml:space="preserve">uno o varios periodos mensuales de carga</w:t>
+      </w:r>
+      <w:r>
+        <w:t xml:space="preserve">, y</w:t>
+      </w:r>
+      <w:r>
+        <w:t xml:space="preserve"> </w:t>
+      </w:r>
+      <w:r>
+        <w:rPr>
+          <w:bCs/>
+          <w:b/>
+        </w:rPr>
+        <w:t xml:space="preserve">nosotros hemos perdido ventas sin saberlo</w:t>
       </w:r>
       <w:r>
         <w:t xml:space="preserve">, y las entidades públicas han perdido una opción válida para comprar.</w:t>
@@ -1041,26 +1114,7 @@
         <w:t xml:space="preserve">SOLICITAMOS</w:t>
       </w:r>
       <w:r>
-        <w:t xml:space="preserve"> </w:t>
-      </w:r>
-      <w:r>
-        <w:t xml:space="preserve">que en un plazo</w:t>
-      </w:r>
-      <w:r>
-        <w:t xml:space="preserve"> </w:t>
-      </w:r>
-      <w:r>
-        <w:rPr>
-          <w:bCs/>
-          <w:b/>
-        </w:rPr>
-        <w:t xml:space="preserve">no mayor de cinco (5) días hábiles</w:t>
-      </w:r>
-      <w:r>
-        <w:t xml:space="preserve"> </w:t>
-      </w:r>
-      <w:r>
-        <w:t xml:space="preserve">desde la recepción de esta carta:</w:t>
+        <w:t xml:space="preserve">:</w:t>
       </w:r>
     </w:p>
     <w:p>
@@ -1076,13 +1130,26 @@
           <w:bCs/>
           <w:b/>
         </w:rPr>
-        <w:t xml:space="preserve">Se habiliten de inmediato</w:t>
-      </w:r>
-      <w:r>
-        <w:t xml:space="preserve"> </w:t>
-      </w:r>
-      <w:r>
-        <w:t xml:space="preserve">todas las fichas-producto de la marca</w:t>
+        <w:t xml:space="preserve">Se habiliten de inmediato, en un plazo no mayor de veinticuatro (24) horas</w:t>
+      </w:r>
+      <w:r>
+        <w:t xml:space="preserve"> </w:t>
+      </w:r>
+      <w:r>
+        <w:t xml:space="preserve">y en todo caso</w:t>
+      </w:r>
+      <w:r>
+        <w:t xml:space="preserve"> </w:t>
+      </w:r>
+      <w:r>
+        <w:rPr>
+          <w:bCs/>
+          <w:b/>
+        </w:rPr>
+        <w:t xml:space="preserve">antes del cierre del periodo de carga del 9 de octubre de 2026</w:t>
+      </w:r>
+      <w:r>
+        <w:t xml:space="preserve">, todas las fichas-producto de la marca</w:t>
       </w:r>
       <w:r>
         <w:t xml:space="preserve"> </w:t>
@@ -1111,7 +1178,55 @@
           <w:bCs/>
           <w:b/>
         </w:rPr>
+        <w:t xml:space="preserve">Si no fuera posible habilitarlas antes del 9 de octubre</w:t>
+      </w:r>
+      <w:r>
+        <w:t xml:space="preserve">, se otorgue a los proveedores un</w:t>
+      </w:r>
+      <w:r>
+        <w:t xml:space="preserve"> </w:t>
+      </w:r>
+      <w:r>
+        <w:rPr>
+          <w:bCs/>
+          <w:b/>
+        </w:rPr>
+        <w:t xml:space="preserve">plazo extraordinario</w:t>
+      </w:r>
+      <w:r>
+        <w:t xml:space="preserve"> </w:t>
+      </w:r>
+      <w:r>
+        <w:t xml:space="preserve">para subir las fichas MOBIS, equivalente a los días perdidos por causas ajenas a ellos y a nosotros.</w:t>
+      </w:r>
+    </w:p>
+    <w:p>
+      <w:pPr>
+        <w:numPr>
+          <w:ilvl w:val="0"/>
+          <w:numId w:val="1002"/>
+        </w:numPr>
+        <w:pStyle w:val="Compact"/>
+      </w:pPr>
+      <w:r>
+        <w:rPr>
+          <w:bCs/>
+          <w:b/>
+        </w:rPr>
         <w:t xml:space="preserve">Se nos informe por escrito</w:t>
+      </w:r>
+      <w:r>
+        <w:t xml:space="preserve">, en un plazo</w:t>
+      </w:r>
+      <w:r>
+        <w:t xml:space="preserve"> </w:t>
+      </w:r>
+      <w:r>
+        <w:rPr>
+          <w:bCs/>
+          <w:b/>
+        </w:rPr>
+        <w:t xml:space="preserve">no mayor de cinco (5) días hábiles</w:t>
       </w:r>
       <w:r>
         <w:t xml:space="preserve">:</w:t>
@@ -1482,7 +1597,20 @@
         <w:pStyle w:val="BodyText"/>
       </w:pPr>
       <w:r>
-        <w:t xml:space="preserve">Confiamos en que su Dirección atenderá este pedido con la urgencia que corresponde.</w:t>
+        <w:t xml:space="preserve">Confiamos en que su Dirección atenderá este pedido con la urgencia que corresponde, considerando que</w:t>
+      </w:r>
+      <w:r>
+        <w:t xml:space="preserve"> </w:t>
+      </w:r>
+      <w:r>
+        <w:rPr>
+          <w:bCs/>
+          <w:b/>
+        </w:rPr>
+        <w:t xml:space="preserve">el periodo de carga de fichas vence el 9 de octubre de 2026</w:t>
+      </w:r>
+      <w:r>
+        <w:t xml:space="preserve">.</w:t>
       </w:r>
     </w:p>
     <w:p>
@@ -1649,7 +1777,7 @@
         <w:t xml:space="preserve"> </w:t>
       </w:r>
       <w:r>
-        <w:t xml:space="preserve">Capturas de la plataforma (perfil proveedor), módulo</w:t>
+        <w:t xml:space="preserve">Capturas de la plataforma de Catálogos Electrónicos (perfil proveedor), módulo</w:t>
       </w:r>
       <w:r>
         <w:t xml:space="preserve"> </w:t>
@@ -1667,7 +1795,386 @@
         <w:t xml:space="preserve">.</w:t>
       </w:r>
     </w:p>
+    <w:p>
+      <w:r>
+        <w:br w:type="page"/>
+      </w:r>
+    </w:p>
     <w:bookmarkEnd w:id="24"/>
+    <w:bookmarkStart w:id="28" w:name="X98b4be08264d69fcc2413f5ee0e8b7e038bb65d"/>
+    <w:p>
+      <w:pPr>
+        <w:pStyle w:val="Heading2"/>
+      </w:pPr>
+      <w:r>
+        <w:t xml:space="preserve">ANEXO 1 – Formato N.° 397-2025-ARM (acreditación de la marca MOBIS)</w:t>
+      </w:r>
+    </w:p>
+    <w:p>
+      <w:pPr>
+        <w:pStyle w:val="FirstParagraph"/>
+      </w:pPr>
+      <w:r>
+        <w:drawing>
+          <wp:inline>
+            <wp:extent cx="5334000" cy="7541957"/>
+            <wp:effectExtent b="0" l="0" r="0" t="0"/>
+            <wp:docPr descr="" title="" id="26" name="Picture"/>
+            <a:graphic>
+              <a:graphicData uri="http://schemas.openxmlformats.org/drawingml/2006/picture">
+                <pic:pic>
+                  <pic:nvPicPr>
+                    <pic:cNvPr descr="anexos/anexo1_acreditacion.png" id="27" name="Picture"/>
+                    <pic:cNvPicPr>
+                      <a:picLocks noChangeArrowheads="1" noChangeAspect="1"/>
+                    </pic:cNvPicPr>
+                  </pic:nvPicPr>
+                  <pic:blipFill>
+                    <a:blip r:embed="rId25"/>
+                    <a:stretch>
+                      <a:fillRect/>
+                    </a:stretch>
+                  </pic:blipFill>
+                  <pic:spPr bwMode="auto">
+                    <a:xfrm>
+                      <a:off x="0" y="0"/>
+                      <a:ext cx="5334000" cy="7541957"/>
+                    </a:xfrm>
+                    <a:prstGeom prst="rect">
+                      <a:avLst/>
+                    </a:prstGeom>
+                    <a:noFill/>
+                    <a:ln w="9525">
+                      <a:noFill/>
+                      <a:headEnd/>
+                      <a:tailEnd/>
+                    </a:ln>
+                  </pic:spPr>
+                </pic:pic>
+              </a:graphicData>
+            </a:graphic>
+          </wp:inline>
+        </w:drawing>
+      </w:r>
+    </w:p>
+    <w:p>
+      <w:r>
+        <w:br w:type="page"/>
+      </w:r>
+    </w:p>
+    <w:bookmarkEnd w:id="28"/>
+    <w:bookmarkStart w:id="29" w:name="X70331ef1aa9e7b55ec69b7adcc3ffa85ea35eec"/>
+    <w:p>
+      <w:pPr>
+        <w:pStyle w:val="Heading2"/>
+      </w:pPr>
+      <w:r>
+        <w:t xml:space="preserve">ANEXO 2 – Mensaje del proveedor (2 de octubre de 2026)</w:t>
+      </w:r>
+    </w:p>
+    <w:p>
+      <w:pPr>
+        <w:pStyle w:val="FirstParagraph"/>
+      </w:pPr>
+      <w:r>
+        <w:t xml:space="preserve">[INSERTAR AQUÍ LA CAPTURA DE WHATSAPP DEL PROVEEDOR, CON SU NÚMERO DE TELÉFONO TAPADO]</w:t>
+      </w:r>
+    </w:p>
+    <w:p>
+      <w:pPr>
+        <w:pStyle w:val="BodyText"/>
+      </w:pPr>
+      <w:r>
+        <w:t xml:space="preserve">El proveedor indica:</w:t>
+      </w:r>
+      <w:r>
+        <w:t xml:space="preserve"> </w:t>
+      </w:r>
+      <w:r>
+        <w:rPr>
+          <w:iCs/>
+          <w:i/>
+        </w:rPr>
+        <w:t xml:space="preserve">“</w:t>
+      </w:r>
+      <w:r>
+        <w:rPr>
+          <w:iCs/>
+          <w:i/>
+        </w:rPr>
+        <w:t xml:space="preserve">Disculpe, me llegó un correo con el stock de su marca, pero no logro ver su marca en Perú Compras en plataforma.</w:t>
+      </w:r>
+      <w:r>
+        <w:rPr>
+          <w:iCs/>
+          <w:i/>
+        </w:rPr>
+        <w:t xml:space="preserve">”</w:t>
+      </w:r>
+    </w:p>
+    <w:p>
+      <w:r>
+        <w:br w:type="page"/>
+      </w:r>
+    </w:p>
+    <w:bookmarkEnd w:id="29"/>
+    <w:bookmarkStart w:id="39" w:name="X662f433ed1b42ef72f312f146cb6d7b29e7ddad"/>
+    <w:p>
+      <w:pPr>
+        <w:pStyle w:val="Heading2"/>
+      </w:pPr>
+      <w:r>
+        <w:t xml:space="preserve">ANEXO 3 – Capturas de la plataforma (perfil proveedor)</w:t>
+      </w:r>
+    </w:p>
+    <w:p>
+      <w:pPr>
+        <w:pStyle w:val="FirstParagraph"/>
+      </w:pPr>
+      <w:r>
+        <w:rPr>
+          <w:bCs/>
+          <w:b/>
+        </w:rPr>
+        <w:t xml:space="preserve">3.1. Búsqueda de un modelo de la marca MOBIS:</w:t>
+      </w:r>
+      <w:r>
+        <w:rPr>
+          <w:bCs/>
+          <w:b/>
+        </w:rPr>
+        <w:t xml:space="preserve"> </w:t>
+      </w:r>
+      <w:r>
+        <w:rPr>
+          <w:bCs/>
+          <w:b/>
+        </w:rPr>
+        <w:t xml:space="preserve">“</w:t>
+      </w:r>
+      <w:r>
+        <w:rPr>
+          <w:bCs/>
+          <w:b/>
+        </w:rPr>
+        <w:t xml:space="preserve">No se encontraron registros</w:t>
+      </w:r>
+      <w:r>
+        <w:rPr>
+          <w:bCs/>
+          <w:b/>
+        </w:rPr>
+        <w:t xml:space="preserve">”</w:t>
+      </w:r>
+      <w:r>
+        <w:rPr>
+          <w:bCs/>
+          <w:b/>
+        </w:rPr>
+        <w:t xml:space="preserve">.</w:t>
+      </w:r>
+    </w:p>
+    <w:p>
+      <w:pPr>
+        <w:pStyle w:val="BodyText"/>
+      </w:pPr>
+      <w:r>
+        <w:drawing>
+          <wp:inline>
+            <wp:extent cx="5334000" cy="2592412"/>
+            <wp:effectExtent b="0" l="0" r="0" t="0"/>
+            <wp:docPr descr="" title="" id="31" name="Picture"/>
+            <a:graphic>
+              <a:graphicData uri="http://schemas.openxmlformats.org/drawingml/2006/picture">
+                <pic:pic>
+                  <pic:nvPicPr>
+                    <pic:cNvPr descr="anexos/anexo3a_busqueda_bolonia.png" id="32" name="Picture"/>
+                    <pic:cNvPicPr>
+                      <a:picLocks noChangeArrowheads="1" noChangeAspect="1"/>
+                    </pic:cNvPicPr>
+                  </pic:nvPicPr>
+                  <pic:blipFill>
+                    <a:blip r:embed="rId30"/>
+                    <a:stretch>
+                      <a:fillRect/>
+                    </a:stretch>
+                  </pic:blipFill>
+                  <pic:spPr bwMode="auto">
+                    <a:xfrm>
+                      <a:off x="0" y="0"/>
+                      <a:ext cx="5334000" cy="2592412"/>
+                    </a:xfrm>
+                    <a:prstGeom prst="rect">
+                      <a:avLst/>
+                    </a:prstGeom>
+                    <a:noFill/>
+                    <a:ln w="9525">
+                      <a:noFill/>
+                      <a:headEnd/>
+                      <a:tailEnd/>
+                    </a:ln>
+                  </pic:spPr>
+                </pic:pic>
+              </a:graphicData>
+            </a:graphic>
+          </wp:inline>
+        </w:drawing>
+      </w:r>
+    </w:p>
+    <w:p>
+      <w:pPr>
+        <w:pStyle w:val="BodyText"/>
+      </w:pPr>
+      <w:r>
+        <w:rPr>
+          <w:bCs/>
+          <w:b/>
+        </w:rPr>
+        <w:t xml:space="preserve">3.2. Búsqueda</w:t>
+      </w:r>
+      <w:r>
+        <w:rPr>
+          <w:bCs/>
+          <w:b/>
+        </w:rPr>
+        <w:t xml:space="preserve"> </w:t>
+      </w:r>
+      <w:r>
+        <w:rPr>
+          <w:bCs/>
+          <w:b/>
+        </w:rPr>
+        <w:t xml:space="preserve">“</w:t>
+      </w:r>
+      <w:r>
+        <w:rPr>
+          <w:bCs/>
+          <w:b/>
+        </w:rPr>
+        <w:t xml:space="preserve">mobis</w:t>
+      </w:r>
+      <w:r>
+        <w:rPr>
+          <w:bCs/>
+          <w:b/>
+        </w:rPr>
+        <w:t xml:space="preserve">”</w:t>
+      </w:r>
+      <w:r>
+        <w:rPr>
+          <w:bCs/>
+          <w:b/>
+        </w:rPr>
+        <w:t xml:space="preserve">: el sistema muestra fichas de otra marca (MOBISEAT), pero no las de MOBIS.</w:t>
+      </w:r>
+    </w:p>
+    <w:p>
+      <w:pPr>
+        <w:pStyle w:val="BodyText"/>
+      </w:pPr>
+      <w:r>
+        <w:drawing>
+          <wp:inline>
+            <wp:extent cx="4319999" cy="3475327"/>
+            <wp:effectExtent b="0" l="0" r="0" t="0"/>
+            <wp:docPr descr="" title="" id="34" name="Picture"/>
+            <a:graphic>
+              <a:graphicData uri="http://schemas.openxmlformats.org/drawingml/2006/picture">
+                <pic:pic>
+                  <pic:nvPicPr>
+                    <pic:cNvPr descr="anexos/anexo3b_busqueda_mobis.png" id="35" name="Picture"/>
+                    <pic:cNvPicPr>
+                      <a:picLocks noChangeArrowheads="1" noChangeAspect="1"/>
+                    </pic:cNvPicPr>
+                  </pic:nvPicPr>
+                  <pic:blipFill>
+                    <a:blip r:embed="rId33"/>
+                    <a:stretch>
+                      <a:fillRect/>
+                    </a:stretch>
+                  </pic:blipFill>
+                  <pic:spPr bwMode="auto">
+                    <a:xfrm>
+                      <a:off x="0" y="0"/>
+                      <a:ext cx="4319999" cy="3475327"/>
+                    </a:xfrm>
+                    <a:prstGeom prst="rect">
+                      <a:avLst/>
+                    </a:prstGeom>
+                    <a:noFill/>
+                    <a:ln w="9525">
+                      <a:noFill/>
+                      <a:headEnd/>
+                      <a:tailEnd/>
+                    </a:ln>
+                  </pic:spPr>
+                </pic:pic>
+              </a:graphicData>
+            </a:graphic>
+          </wp:inline>
+        </w:drawing>
+      </w:r>
+    </w:p>
+    <w:p>
+      <w:pPr>
+        <w:pStyle w:val="BodyText"/>
+      </w:pPr>
+      <w:r>
+        <w:rPr>
+          <w:bCs/>
+          <w:b/>
+        </w:rPr>
+        <w:t xml:space="preserve">3.3. En cambio, las fichas de otras marcas sí aparecen y se pueden ofertar (ejemplo: EC ERGOCORP – GER213-SG).</w:t>
+      </w:r>
+    </w:p>
+    <w:p>
+      <w:pPr>
+        <w:pStyle w:val="BodyText"/>
+      </w:pPr>
+      <w:r>
+        <w:drawing>
+          <wp:inline>
+            <wp:extent cx="4319999" cy="2594863"/>
+            <wp:effectExtent b="0" l="0" r="0" t="0"/>
+            <wp:docPr descr="" title="" id="37" name="Picture"/>
+            <a:graphic>
+              <a:graphicData uri="http://schemas.openxmlformats.org/drawingml/2006/picture">
+                <pic:pic>
+                  <pic:nvPicPr>
+                    <pic:cNvPr descr="anexos/anexo3c_otra_marca_si_aparece.png" id="38" name="Picture"/>
+                    <pic:cNvPicPr>
+                      <a:picLocks noChangeArrowheads="1" noChangeAspect="1"/>
+                    </pic:cNvPicPr>
+                  </pic:nvPicPr>
+                  <pic:blipFill>
+                    <a:blip r:embed="rId36"/>
+                    <a:stretch>
+                      <a:fillRect/>
+                    </a:stretch>
+                  </pic:blipFill>
+                  <pic:spPr bwMode="auto">
+                    <a:xfrm>
+                      <a:off x="0" y="0"/>
+                      <a:ext cx="4319999" cy="2594863"/>
+                    </a:xfrm>
+                    <a:prstGeom prst="rect">
+                      <a:avLst/>
+                    </a:prstGeom>
+                    <a:noFill/>
+                    <a:ln w="9525">
+                      <a:noFill/>
+                      <a:headEnd/>
+                      <a:tailEnd/>
+                    </a:ln>
+                  </pic:spPr>
+                </pic:pic>
+              </a:graphicData>
+            </a:graphic>
+          </wp:inline>
+        </w:drawing>
+      </w:r>
+    </w:p>
+    <w:bookmarkEnd w:id="39"/>
     <w:sectPr/>
   </w:body>
 </w:document>

</xml_diff>